<commit_message>
Add configurable style-mapping for body text and lists
Lets users map Pandoc's context-dependent body/list style names
(FirstParagraph, Compact, etc.) onto their own reference-doc styles via
format.docx.officequarto-styles, mirroring officedown's mapstyles/ol.style/
ul.style. Lists are detected via <w:numPr> and bullet-vs-numbered via
numbering.xml numFmt, since Pandoc uses the same style name for both.

Co-Authored-By: Claude Sonnet 5 <noreply@anthropic.com>
Claude-Session: https://claude.ai/code/session_01D9p4v2CsWxwXRDH28EjC8Y
</commit_message>
<xml_diff>
--- a/template/original.docx
+++ b/template/original.docx
@@ -1197,6 +1197,32 @@
     <w:next w:val="Normal"/>
     <w:rsid w:val="00901463"/>
   </w:style>
+  <w:style xmlns:w="http://schemas.openxmlformats.org/wordprocessingml/2006/main" w:type="paragraph" w:customStyle="1" w:styleId="FliesstextACME">
+    <w:name w:val="Fließtext ACME"/>
+    <w:basedOn w:val="Normal"/>
+    <w:qFormat/>
+    <w:rPr>
+      <w:i/>
+      <w:color w:val="1F4E79"/>
+    </w:rPr>
+  </w:style>
+  <w:style xmlns:w="http://schemas.openxmlformats.org/wordprocessingml/2006/main" w:type="paragraph" w:customStyle="1" w:styleId="AufzaehlungACME">
+    <w:name w:val="Aufzählung ACME"/>
+    <w:basedOn w:val="Normal"/>
+    <w:qFormat/>
+    <w:rPr>
+      <w:color w:val="A6192E"/>
+    </w:rPr>
+  </w:style>
+  <w:style xmlns:w="http://schemas.openxmlformats.org/wordprocessingml/2006/main" w:type="paragraph" w:customStyle="1" w:styleId="NummerierungACME">
+    <w:name w:val="Nummerierung ACME"/>
+    <w:basedOn w:val="Normal"/>
+    <w:qFormat/>
+    <w:rPr>
+      <w:b/>
+      <w:color w:val="2E7D32"/>
+    </w:rPr>
+  </w:style>
 </w:styles>
 </file>
 

</xml_diff>

<commit_message>
feat(style-mapping): add list-letter option
New officequarto-styles.list-letter option maps lettered-list paragraphs
(a./b./c. or A./B./C. markdown markers, Word numFmt lowerLetter/upperLetter)
onto a configured Word style - previously these fell into list-number's
catch-all "anything but bullet" bucket alongside decimal/roman lists.

No officedown equivalent exists for this, so it ships without an alias.
Verified against a real render (dev/spike-notes.md Spike G): Pandoc's docx
writer does emit a distinguishable lowerLetter numFmt, confirmed empirically
before implementing.

Co-Authored-By: Claude Sonnet 5 <noreply@anthropic.com>
Claude-Session: https://claude.ai/code/session_014DP2kcFwm3TKbHXTrp3cFP
</commit_message>
<xml_diff>
--- a/template/original.docx
+++ b/template/original.docx
@@ -1232,6 +1232,15 @@
       <w:color w:val="6A1B9A"/>
     </w:rPr>
   </w:style>
+  <w:style xmlns:w="http://schemas.openxmlformats.org/wordprocessingml/2006/main" w:type="paragraph" w:customStyle="1" w:styleId="BuchstabierungACME">
+    <w:name w:val="Buchstabierung ACME"/>
+    <w:basedOn w:val="Normal"/>
+    <w:qFormat/>
+    <w:rPr>
+      <w:u w:val="single"/>
+      <w:color w:val="E65100"/>
+    </w:rPr>
+  </w:style>
 </w:styles>
 </file>
 

</xml_diff>